<commit_message>
docs: pilot log sample - successful low-speed run (stand, +0.1 m/s, return), updated Word/PDF/RTF/DOC
</commit_message>
<xml_diff>
--- a/docs/pilot-log-request.docx
+++ b/docs/pilot-log-request.docx
@@ -464,7 +464,7 @@
           <w:b/>
           <w:spacing w:val="0"/>
         </w:rPr>
-        <w:t xml:space="preserve">Delivered sample — 2026-09-16 18:00 (America/Los_Angeles)</w:t>
+        <w:t xml:space="preserve">Delivered sample — 2026-09-16 18:12 (America/Los_Angeles)</w:t>
       </w:r>
     </w:p>
     <w:p>
@@ -479,151 +479,137 @@
           <w:b/>
           <w:spacing w:val="0"/>
         </w:rPr>
-        <w:t xml:space="preserve">What was executed</w:t>
-      </w:r>
-    </w:p>
-    <w:p>
-      <w:pPr>
-        <w:spacing w:after="240"/>
-      </w:pPr>
-      <w:r>
-        <w:rPr>
-          <w:rFonts w:ascii="Times" w:hAnsi="Times" w:cs="Times"/>
-          <w:sz w:val="24"/>
-          <w:sz-cs w:val="24"/>
-          <w:spacing w:val="0"/>
-        </w:rPr>
-        <w:t xml:space="preserve">The requested low-speed motion protocol, run on the robot with the manufacturer’s own high-level UDP interface (no third-party software), while a timestamped log collector ran alongside:</w:t>
-      </w:r>
-    </w:p>
-    <w:p>
-      <w:pPr>
-        <w:ind w:left="720" w:first-line="-720"/>
-      </w:pPr>
-      <w:r>
-        <w:rPr>
-          <w:rFonts w:ascii="Times" w:hAnsi="Times" w:cs="Times"/>
-          <w:sz w:val="24"/>
-          <w:sz-cs w:val="24"/>
-        </w:rPr>
-        <w:t xml:space="preserve"/>
-        <w:tab/>
-        <w:t xml:space="preserve">•</w:t>
-        <w:tab/>
-        <w:t xml:space="preserve"/>
-      </w:r>
-      <w:r>
-        <w:rPr>
-          <w:rFonts w:ascii="Times" w:hAnsi="Times" w:cs="Times"/>
-          <w:sz w:val="24"/>
-          <w:sz-cs w:val="24"/>
-          <w:spacing w:val="0"/>
-        </w:rPr>
-        <w:t xml:space="preserve">hold neutral — 8.0 s</w:t>
-      </w:r>
-    </w:p>
-    <w:p>
-      <w:pPr>
-        <w:ind w:left="720" w:first-line="-720"/>
-      </w:pPr>
-      <w:r>
-        <w:rPr>
-          <w:rFonts w:ascii="Times" w:hAnsi="Times" w:cs="Times"/>
-          <w:sz w:val="24"/>
-          <w:sz-cs w:val="24"/>
-        </w:rPr>
-        <w:t xml:space="preserve"/>
-        <w:tab/>
-        <w:t xml:space="preserve">•</w:t>
-        <w:tab/>
-        <w:t xml:space="preserve"/>
-      </w:r>
-      <w:r>
-        <w:rPr>
-          <w:rFonts w:ascii="Times" w:hAnsi="Times" w:cs="Times"/>
-          <w:sz w:val="24"/>
-          <w:sz-cs w:val="24"/>
-          <w:spacing w:val="0"/>
-        </w:rPr>
-        <w:t xml:space="preserve">move slowly forward — 0.10 m/s for 2.9 s</w:t>
-      </w:r>
-    </w:p>
-    <w:p>
-      <w:pPr>
-        <w:ind w:left="720" w:first-line="-720"/>
-      </w:pPr>
-      <w:r>
-        <w:rPr>
-          <w:rFonts w:ascii="Times" w:hAnsi="Times" w:cs="Times"/>
-          <w:sz w:val="24"/>
-          <w:sz-cs w:val="24"/>
-        </w:rPr>
-        <w:t xml:space="preserve"/>
-        <w:tab/>
-        <w:t xml:space="preserve">•</w:t>
-        <w:tab/>
-        <w:t xml:space="preserve"/>
-      </w:r>
-      <w:r>
-        <w:rPr>
-          <w:rFonts w:ascii="Times" w:hAnsi="Times" w:cs="Times"/>
-          <w:sz w:val="24"/>
-          <w:sz-cs w:val="24"/>
-          <w:spacing w:val="0"/>
-        </w:rPr>
-        <w:t xml:space="preserve">hold — 2.0 s</w:t>
-      </w:r>
-    </w:p>
-    <w:p>
-      <w:pPr>
-        <w:ind w:left="720" w:first-line="-720"/>
-      </w:pPr>
-      <w:r>
-        <w:rPr>
-          <w:rFonts w:ascii="Times" w:hAnsi="Times" w:cs="Times"/>
-          <w:sz w:val="24"/>
-          <w:sz-cs w:val="24"/>
-        </w:rPr>
-        <w:t xml:space="preserve"/>
-        <w:tab/>
-        <w:t xml:space="preserve">•</w:t>
-        <w:tab/>
-        <w:t xml:space="preserve"/>
-      </w:r>
-      <w:r>
-        <w:rPr>
-          <w:rFonts w:ascii="Times" w:hAnsi="Times" w:cs="Times"/>
-          <w:sz w:val="24"/>
-          <w:sz-cs w:val="24"/>
-          <w:spacing w:val="0"/>
-        </w:rPr>
-        <w:t xml:space="preserve">return (reverse) — −0.10 m/s for 2.4 s</w:t>
-      </w:r>
-    </w:p>
-    <w:p>
-      <w:pPr>
-        <w:ind w:left="720" w:first-line="-720"/>
-      </w:pPr>
-      <w:r>
-        <w:rPr>
-          <w:rFonts w:ascii="Times" w:hAnsi="Times" w:cs="Times"/>
-          <w:sz w:val="24"/>
-          <w:sz-cs w:val="24"/>
-        </w:rPr>
-        <w:t xml:space="preserve"/>
-        <w:tab/>
-        <w:t xml:space="preserve">•</w:t>
-        <w:tab/>
-        <w:t xml:space="preserve"/>
-      </w:r>
-      <w:r>
-        <w:rPr>
-          <w:rFonts w:ascii="Times" w:hAnsi="Times" w:cs="Times"/>
-          <w:sz w:val="24"/>
-          <w:sz-cs w:val="24"/>
-          <w:spacing w:val="0"/>
-        </w:rPr>
-        <w:t xml:space="preserve">hold — 5.0 s, then stop (brake frames)</w:t>
+        <w:t xml:space="preserve">What was executed (robot moved: forward, then back)</w:t>
+      </w:r>
+    </w:p>
+    <w:p>
+      <w:pPr>
+        <w:ind w:left="720" w:first-line="-720"/>
+      </w:pPr>
+      <w:r>
+        <w:rPr>
+          <w:rFonts w:ascii="Times" w:hAnsi="Times" w:cs="Times"/>
+          <w:sz w:val="24"/>
+          <w:sz-cs w:val="24"/>
+        </w:rPr>
+        <w:t xml:space="preserve"/>
+        <w:tab/>
+        <w:t xml:space="preserve">•</w:t>
+        <w:tab/>
+        <w:t xml:space="preserve"/>
+      </w:r>
+      <w:r>
+        <w:rPr>
+          <w:rFonts w:ascii="Times" w:hAnsi="Times" w:cs="Times"/>
+          <w:sz w:val="24"/>
+          <w:sz-cs w:val="24"/>
+          <w:spacing w:val="0"/>
+        </w:rPr>
+        <w:t xml:space="preserve">robot stood up (posture command) — then hold neutral 8.4 s</w:t>
+      </w:r>
+    </w:p>
+    <w:p>
+      <w:pPr>
+        <w:ind w:left="720" w:first-line="-720"/>
+      </w:pPr>
+      <w:r>
+        <w:rPr>
+          <w:rFonts w:ascii="Times" w:hAnsi="Times" w:cs="Times"/>
+          <w:sz w:val="24"/>
+          <w:sz-cs w:val="24"/>
+        </w:rPr>
+        <w:t xml:space="preserve"/>
+        <w:tab/>
+        <w:t xml:space="preserve">•</w:t>
+        <w:tab/>
+        <w:t xml:space="preserve"/>
+      </w:r>
+      <w:r>
+        <w:rPr>
+          <w:rFonts w:ascii="Times" w:hAnsi="Times" w:cs="Times"/>
+          <w:sz w:val="24"/>
+          <w:sz-cs w:val="24"/>
+          <w:spacing w:val="0"/>
+        </w:rPr>
+        <w:t xml:space="preserve">move slowly forward — +0.10 m/s for 2.4 s</w:t>
+      </w:r>
+    </w:p>
+    <w:p>
+      <w:pPr>
+        <w:ind w:left="720" w:first-line="-720"/>
+      </w:pPr>
+      <w:r>
+        <w:rPr>
+          <w:rFonts w:ascii="Times" w:hAnsi="Times" w:cs="Times"/>
+          <w:sz w:val="24"/>
+          <w:sz-cs w:val="24"/>
+        </w:rPr>
+        <w:t xml:space="preserve"/>
+        <w:tab/>
+        <w:t xml:space="preserve">•</w:t>
+        <w:tab/>
+        <w:t xml:space="preserve"/>
+      </w:r>
+      <w:r>
+        <w:rPr>
+          <w:rFonts w:ascii="Times" w:hAnsi="Times" w:cs="Times"/>
+          <w:sz w:val="24"/>
+          <w:sz-cs w:val="24"/>
+          <w:spacing w:val="0"/>
+        </w:rPr>
+        <w:t xml:space="preserve">hold — 2.1 s</w:t>
+      </w:r>
+    </w:p>
+    <w:p>
+      <w:pPr>
+        <w:ind w:left="720" w:first-line="-720"/>
+      </w:pPr>
+      <w:r>
+        <w:rPr>
+          <w:rFonts w:ascii="Times" w:hAnsi="Times" w:cs="Times"/>
+          <w:sz w:val="24"/>
+          <w:sz-cs w:val="24"/>
+        </w:rPr>
+        <w:t xml:space="preserve"/>
+        <w:tab/>
+        <w:t xml:space="preserve">•</w:t>
+        <w:tab/>
+        <w:t xml:space="preserve"/>
+      </w:r>
+      <w:r>
+        <w:rPr>
+          <w:rFonts w:ascii="Times" w:hAnsi="Times" w:cs="Times"/>
+          <w:sz w:val="24"/>
+          <w:sz-cs w:val="24"/>
+          <w:spacing w:val="0"/>
+        </w:rPr>
+        <w:t xml:space="preserve">return (reverse) — −0.10 m/s for 2.5 s</w:t>
+      </w:r>
+    </w:p>
+    <w:p>
+      <w:pPr>
+        <w:ind w:left="720" w:first-line="-720"/>
+      </w:pPr>
+      <w:r>
+        <w:rPr>
+          <w:rFonts w:ascii="Times" w:hAnsi="Times" w:cs="Times"/>
+          <w:sz w:val="24"/>
+          <w:sz-cs w:val="24"/>
+        </w:rPr>
+        <w:t xml:space="preserve"/>
+        <w:tab/>
+        <w:t xml:space="preserve">•</w:t>
+        <w:tab/>
+        <w:t xml:space="preserve"/>
+      </w:r>
+      <w:r>
+        <w:rPr>
+          <w:rFonts w:ascii="Times" w:hAnsi="Times" w:cs="Times"/>
+          <w:sz w:val="24"/>
+          <w:sz-cs w:val="24"/>
+          <w:spacing w:val="0"/>
+        </w:rPr>
+        <w:t xml:space="preserve">hold — 4.5 s, then stop (brake frames)</w:t>
       </w:r>
     </w:p>
     <w:p>
@@ -638,85 +624,85 @@
           <w:b/>
           <w:spacing w:val="0"/>
         </w:rPr>
-        <w:t xml:space="preserve">Files</w:t>
-      </w:r>
-    </w:p>
-    <w:p>
-      <w:pPr>
-        <w:ind w:left="720" w:first-line="-720"/>
-      </w:pPr>
-      <w:r>
-        <w:rPr>
-          <w:rFonts w:ascii="Times" w:hAnsi="Times" w:cs="Times"/>
-          <w:sz w:val="24"/>
-          <w:sz-cs w:val="24"/>
-        </w:rPr>
-        <w:t xml:space="preserve"/>
-        <w:tab/>
-        <w:t xml:space="preserve">•</w:t>
-        <w:tab/>
-        <w:t xml:space="preserve"/>
-      </w:r>
-      <w:r>
-        <w:rPr>
-          <w:rFonts w:ascii="Times" w:hAnsi="Times" w:cs="Times"/>
-          <w:sz w:val="24"/>
-          <w:sz-cs w:val="24"/>
-          <w:spacing w:val="0"/>
-        </w:rPr>
-        <w:t xml:space="preserve">pilot_slow_move-20260916-180040.csv — one row per event: timestamps (ISO + elapsed), command rows (elapsed_s, cmd_vx/vy/wz, result) and frame rows (code, size, decoded fields)</w:t>
-      </w:r>
-    </w:p>
-    <w:p>
-      <w:pPr>
-        <w:ind w:left="720" w:first-line="-720"/>
-      </w:pPr>
-      <w:r>
-        <w:rPr>
-          <w:rFonts w:ascii="Times" w:hAnsi="Times" w:cs="Times"/>
-          <w:sz w:val="24"/>
-          <w:sz-cs w:val="24"/>
-        </w:rPr>
-        <w:t xml:space="preserve"/>
-        <w:tab/>
-        <w:t xml:space="preserve">•</w:t>
-        <w:tab/>
-        <w:t xml:space="preserve"/>
-      </w:r>
-      <w:r>
-        <w:rPr>
-          <w:rFonts w:ascii="Times" w:hAnsi="Times" w:cs="Times"/>
-          <w:sz w:val="24"/>
-          <w:sz-cs w:val="24"/>
-          <w:spacing w:val="0"/>
-        </w:rPr>
-        <w:t xml:space="preserve">pilot_slow_move-20260916-180040.json — same data incl. full metadata block</w:t>
-      </w:r>
-    </w:p>
-    <w:p>
-      <w:pPr>
-        <w:ind w:left="720" w:first-line="-720"/>
-      </w:pPr>
-      <w:r>
-        <w:rPr>
-          <w:rFonts w:ascii="Times" w:hAnsi="Times" w:cs="Times"/>
-          <w:sz w:val="24"/>
-          <w:sz-cs w:val="24"/>
-        </w:rPr>
-        <w:t xml:space="preserve"/>
-        <w:tab/>
-        <w:t xml:space="preserve">•</w:t>
-        <w:tab/>
-        <w:t xml:space="preserve"/>
-      </w:r>
-      <w:r>
-        <w:rPr>
-          <w:rFonts w:ascii="Times" w:hAnsi="Times" w:cs="Times"/>
-          <w:sz w:val="24"/>
-          <w:sz-cs w:val="24"/>
-          <w:spacing w:val="0"/>
-        </w:rPr>
-        <w:t xml:space="preserve">pilot_slow_move-20260916-180040.hex — raw manufacturer frames (hex), as received</w:t>
+        <w:t xml:space="preserve">Files (this run)</w:t>
+      </w:r>
+    </w:p>
+    <w:p>
+      <w:pPr>
+        <w:ind w:left="720" w:first-line="-720"/>
+      </w:pPr>
+      <w:r>
+        <w:rPr>
+          <w:rFonts w:ascii="Times" w:hAnsi="Times" w:cs="Times"/>
+          <w:sz w:val="24"/>
+          <w:sz-cs w:val="24"/>
+        </w:rPr>
+        <w:t xml:space="preserve"/>
+        <w:tab/>
+        <w:t xml:space="preserve">•</w:t>
+        <w:tab/>
+        <w:t xml:space="preserve"/>
+      </w:r>
+      <w:r>
+        <w:rPr>
+          <w:rFonts w:ascii="Times" w:hAnsi="Times" w:cs="Times"/>
+          <w:sz w:val="24"/>
+          <w:sz-cs w:val="24"/>
+          <w:spacing w:val="0"/>
+        </w:rPr>
+        <w:t xml:space="preserve">pilot_slow_move3_sample.csv — one row per event: ISO + elapsed timestamps; command rows (vx/vy/wz + result); frame rows (code, size, decoded fields)</w:t>
+      </w:r>
+    </w:p>
+    <w:p>
+      <w:pPr>
+        <w:ind w:left="720" w:first-line="-720"/>
+      </w:pPr>
+      <w:r>
+        <w:rPr>
+          <w:rFonts w:ascii="Times" w:hAnsi="Times" w:cs="Times"/>
+          <w:sz w:val="24"/>
+          <w:sz-cs w:val="24"/>
+        </w:rPr>
+        <w:t xml:space="preserve"/>
+        <w:tab/>
+        <w:t xml:space="preserve">•</w:t>
+        <w:tab/>
+        <w:t xml:space="preserve"/>
+      </w:r>
+      <w:r>
+        <w:rPr>
+          <w:rFonts w:ascii="Times" w:hAnsi="Times" w:cs="Times"/>
+          <w:sz w:val="24"/>
+          <w:sz-cs w:val="24"/>
+          <w:spacing w:val="0"/>
+        </w:rPr>
+        <w:t xml:space="preserve">pilot_slow_move3_sample.json — same data + full metadata block</w:t>
+      </w:r>
+    </w:p>
+    <w:p>
+      <w:pPr>
+        <w:ind w:left="720" w:first-line="-720"/>
+      </w:pPr>
+      <w:r>
+        <w:rPr>
+          <w:rFonts w:ascii="Times" w:hAnsi="Times" w:cs="Times"/>
+          <w:sz w:val="24"/>
+          <w:sz-cs w:val="24"/>
+        </w:rPr>
+        <w:t xml:space="preserve"/>
+        <w:tab/>
+        <w:t xml:space="preserve">•</w:t>
+        <w:tab/>
+        <w:t xml:space="preserve"/>
+      </w:r>
+      <w:r>
+        <w:rPr>
+          <w:rFonts w:ascii="Times" w:hAnsi="Times" w:cs="Times"/>
+          <w:sz w:val="24"/>
+          <w:sz-cs w:val="24"/>
+          <w:spacing w:val="0"/>
+        </w:rPr>
+        <w:t xml:space="preserve">pilot_slow_move3-20260916-181238.hex — raw manufacturer frames (hex) as received</w:t>
       </w:r>
     </w:p>
     <w:p>
@@ -757,59 +743,59 @@
           <w:sz-cs w:val="24"/>
           <w:spacing w:val="0"/>
         </w:rPr>
-        <w:t xml:space="preserve">duration: 22.0 s · 6 commands · 107 streamed frames</w:t>
-      </w:r>
-    </w:p>
-    <w:p>
-      <w:pPr>
-        <w:ind w:left="720" w:first-line="-720"/>
-      </w:pPr>
-      <w:r>
-        <w:rPr>
-          <w:rFonts w:ascii="Times" w:hAnsi="Times" w:cs="Times"/>
-          <w:sz w:val="24"/>
-          <w:sz-cs w:val="24"/>
-        </w:rPr>
-        <w:t xml:space="preserve"/>
-        <w:tab/>
-        <w:t xml:space="preserve">•</w:t>
-        <w:tab/>
-        <w:t xml:space="preserve"/>
-      </w:r>
-      <w:r>
-        <w:rPr>
-          <w:rFonts w:ascii="Times" w:hAnsi="Times" w:cs="Times"/>
-          <w:sz w:val="24"/>
-          <w:sz-cs w:val="24"/>
-          <w:spacing w:val="0"/>
-        </w:rPr>
-        <w:t xml:space="preserve">streamed frame codes observed: 0x0F01 (28), 0x0F02 (45), 0x0F03 (29), 0x0906 (5) — low-level telemetry frames of the Lite3 motion host (magic 0x1105 header follows the SDK’s RobotData/telemetry family)</w:t>
-      </w:r>
-    </w:p>
-    <w:p>
-      <w:pPr>
-        <w:ind w:left="720" w:first-line="-720"/>
-      </w:pPr>
-      <w:r>
-        <w:rPr>
-          <w:rFonts w:ascii="Times" w:hAnsi="Times" w:cs="Times"/>
-          <w:sz w:val="24"/>
-          <w:sz-cs w:val="24"/>
-        </w:rPr>
-        <w:t xml:space="preserve"/>
-        <w:tab/>
-        <w:t xml:space="preserve">•</w:t>
-        <w:tab/>
-        <w:t xml:space="preserve"/>
-      </w:r>
-      <w:r>
-        <w:rPr>
-          <w:rFonts w:ascii="Times" w:hAnsi="Times" w:cs="Times"/>
-          <w:sz w:val="24"/>
-          <w:sz-cs w:val="24"/>
-          <w:spacing w:val="0"/>
-        </w:rPr>
-        <w:t xml:space="preserve">commands are logged at send time with the exact values; the stream is appended with receive timestamps</w:t>
+        <w:t xml:space="preserve">duration 20.0 s · 5 timestamped commands · 115 streamed frames</w:t>
+      </w:r>
+    </w:p>
+    <w:p>
+      <w:pPr>
+        <w:ind w:left="720" w:first-line="-720"/>
+      </w:pPr>
+      <w:r>
+        <w:rPr>
+          <w:rFonts w:ascii="Times" w:hAnsi="Times" w:cs="Times"/>
+          <w:sz w:val="24"/>
+          <w:sz-cs w:val="24"/>
+        </w:rPr>
+        <w:t xml:space="preserve"/>
+        <w:tab/>
+        <w:t xml:space="preserve">•</w:t>
+        <w:tab/>
+        <w:t xml:space="preserve"/>
+      </w:r>
+      <w:r>
+        <w:rPr>
+          <w:rFonts w:ascii="Times" w:hAnsi="Times" w:cs="Times"/>
+          <w:sz w:val="24"/>
+          <w:sz-cs w:val="24"/>
+          <w:spacing w:val="0"/>
+        </w:rPr>
+        <w:t xml:space="preserve">streamed frame codes: 0x0F02 (49), 0x0F03 (31), 0x0F01 (30), 0x0906 (5) — low-level telemetry frames of the Lite3 motion host</w:t>
+      </w:r>
+    </w:p>
+    <w:p>
+      <w:pPr>
+        <w:ind w:left="720" w:first-line="-720"/>
+      </w:pPr>
+      <w:r>
+        <w:rPr>
+          <w:rFonts w:ascii="Times" w:hAnsi="Times" w:cs="Times"/>
+          <w:sz w:val="24"/>
+          <w:sz-cs w:val="24"/>
+        </w:rPr>
+        <w:t xml:space="preserve"/>
+        <w:tab/>
+        <w:t xml:space="preserve">•</w:t>
+        <w:tab/>
+        <w:t xml:space="preserve"/>
+      </w:r>
+      <w:r>
+        <w:rPr>
+          <w:rFonts w:ascii="Times" w:hAnsi="Times" w:cs="Times"/>
+          <w:sz w:val="24"/>
+          <w:sz-cs w:val="24"/>
+          <w:spacing w:val="0"/>
+        </w:rPr>
+        <w:t xml:space="preserve">commands logged at send time with exact values; inbound frames appended with receive timestamps</w:t>
       </w:r>
     </w:p>
     <w:p>
@@ -876,111 +862,111 @@
           <w:sz-cs w:val="24"/>
           <w:spacing w:val="0"/>
         </w:rPr>
-        <w:t xml:space="preserve">controller: Lite3 motion host, high-level UDP interface (commands 43893, telemetry 43897)</w:t>
-      </w:r>
-    </w:p>
-    <w:p>
-      <w:pPr>
-        <w:ind w:left="720" w:first-line="-720"/>
-      </w:pPr>
-      <w:r>
-        <w:rPr>
-          <w:rFonts w:ascii="Times" w:hAnsi="Times" w:cs="Times"/>
-          <w:sz w:val="24"/>
-          <w:sz-cs w:val="24"/>
-        </w:rPr>
-        <w:t xml:space="preserve"/>
-        <w:tab/>
-        <w:t xml:space="preserve">•</w:t>
-        <w:tab/>
-        <w:t xml:space="preserve"/>
-      </w:r>
-      <w:r>
-        <w:rPr>
-          <w:rFonts w:ascii="Times" w:hAnsi="Times" w:cs="Times"/>
-          <w:sz w:val="24"/>
-          <w:sz-cs w:val="24"/>
-          <w:spacing w:val="0"/>
-        </w:rPr>
-        <w:t xml:space="preserve">SDK used for logging: lite3sdk (zero-dependency, same protocol as the manufacturer’s high-level SDK)</w:t>
-      </w:r>
-    </w:p>
-    <w:p>
-      <w:pPr>
-        <w:ind w:left="720" w:first-line="-720"/>
-      </w:pPr>
-      <w:r>
-        <w:rPr>
-          <w:rFonts w:ascii="Times" w:hAnsi="Times" w:cs="Times"/>
-          <w:sz w:val="24"/>
-          <w:sz-cs w:val="24"/>
-        </w:rPr>
-        <w:t xml:space="preserve"/>
-        <w:tab/>
-        <w:t xml:space="preserve">•</w:t>
-        <w:tab/>
-        <w:t xml:space="preserve"/>
-      </w:r>
-      <w:r>
-        <w:rPr>
-          <w:rFonts w:ascii="Times" w:hAnsi="Times" w:cs="Times"/>
-          <w:sz w:val="24"/>
-          <w:sz-cs w:val="24"/>
-          <w:spacing w:val="0"/>
-        </w:rPr>
-        <w:t xml:space="preserve">logging frequency: as streamed by the robot (receive-timestamped); commands logged per send</w:t>
-      </w:r>
-    </w:p>
-    <w:p>
-      <w:pPr>
-        <w:ind w:left="720" w:first-line="-720"/>
-      </w:pPr>
-      <w:r>
-        <w:rPr>
-          <w:rFonts w:ascii="Times" w:hAnsi="Times" w:cs="Times"/>
-          <w:sz w:val="24"/>
-          <w:sz-cs w:val="24"/>
-        </w:rPr>
-        <w:t xml:space="preserve"/>
-        <w:tab/>
-        <w:t xml:space="preserve">•</w:t>
-        <w:tab/>
-        <w:t xml:space="preserve"/>
-      </w:r>
-      <w:r>
-        <w:rPr>
-          <w:rFonts w:ascii="Times" w:hAnsi="Times" w:cs="Times"/>
-          <w:sz w:val="24"/>
-          <w:sz-cs w:val="24"/>
-          <w:spacing w:val="0"/>
-        </w:rPr>
-        <w:t xml:space="preserve">units: SI (m, m/s, rad, rad/s); raw frames also provided in hex</w:t>
-      </w:r>
-    </w:p>
-    <w:p>
-      <w:pPr>
-        <w:ind w:left="720" w:first-line="-720"/>
-      </w:pPr>
-      <w:r>
-        <w:rPr>
-          <w:rFonts w:ascii="Times" w:hAnsi="Times" w:cs="Times"/>
-          <w:sz w:val="24"/>
-          <w:sz-cs w:val="24"/>
-        </w:rPr>
-        <w:t xml:space="preserve"/>
-        <w:tab/>
-        <w:t xml:space="preserve">•</w:t>
-        <w:tab/>
-        <w:t xml:space="preserve"/>
-      </w:r>
-      <w:r>
-        <w:rPr>
-          <w:rFonts w:ascii="Times" w:hAnsi="Times" w:cs="Times"/>
-          <w:sz w:val="24"/>
-          <w:sz-cs w:val="24"/>
-          <w:spacing w:val="0"/>
-        </w:rPr>
-        <w:t xml:space="preserve">configured limits used: vx ≤ 0.5 m/s, vy ≤ 0.4 m/s, wz ≤ 0.8 rad/s (test ran at 0.1 m/s)</w:t>
+        <w:t xml:space="preserve">controller: Lite3 motion host — high-level UDP interface (commands :43893, telemetry :43897)</w:t>
+      </w:r>
+    </w:p>
+    <w:p>
+      <w:pPr>
+        <w:ind w:left="720" w:first-line="-720"/>
+      </w:pPr>
+      <w:r>
+        <w:rPr>
+          <w:rFonts w:ascii="Times" w:hAnsi="Times" w:cs="Times"/>
+          <w:sz w:val="24"/>
+          <w:sz-cs w:val="24"/>
+        </w:rPr>
+        <w:t xml:space="preserve"/>
+        <w:tab/>
+        <w:t xml:space="preserve">•</w:t>
+        <w:tab/>
+        <w:t xml:space="preserve"/>
+      </w:r>
+      <w:r>
+        <w:rPr>
+          <w:rFonts w:ascii="Times" w:hAnsi="Times" w:cs="Times"/>
+          <w:sz w:val="24"/>
+          <w:sz-cs w:val="24"/>
+          <w:spacing w:val="0"/>
+        </w:rPr>
+        <w:t xml:space="preserve">logging SDK: lite3sdk (zero-dependency; same protocol family as the manufacturer’s high-level SDK)</w:t>
+      </w:r>
+    </w:p>
+    <w:p>
+      <w:pPr>
+        <w:ind w:left="720" w:first-line="-720"/>
+      </w:pPr>
+      <w:r>
+        <w:rPr>
+          <w:rFonts w:ascii="Times" w:hAnsi="Times" w:cs="Times"/>
+          <w:sz w:val="24"/>
+          <w:sz-cs w:val="24"/>
+        </w:rPr>
+        <w:t xml:space="preserve"/>
+        <w:tab/>
+        <w:t xml:space="preserve">•</w:t>
+        <w:tab/>
+        <w:t xml:space="preserve"/>
+      </w:r>
+      <w:r>
+        <w:rPr>
+          <w:rFonts w:ascii="Times" w:hAnsi="Times" w:cs="Times"/>
+          <w:sz w:val="24"/>
+          <w:sz-cs w:val="24"/>
+          <w:spacing w:val="0"/>
+        </w:rPr>
+        <w:t xml:space="preserve">logging frequency: as streamed by the robot, receive-timestamped; every command logged per send</w:t>
+      </w:r>
+    </w:p>
+    <w:p>
+      <w:pPr>
+        <w:ind w:left="720" w:first-line="-720"/>
+      </w:pPr>
+      <w:r>
+        <w:rPr>
+          <w:rFonts w:ascii="Times" w:hAnsi="Times" w:cs="Times"/>
+          <w:sz w:val="24"/>
+          <w:sz-cs w:val="24"/>
+        </w:rPr>
+        <w:t xml:space="preserve"/>
+        <w:tab/>
+        <w:t xml:space="preserve">•</w:t>
+        <w:tab/>
+        <w:t xml:space="preserve"/>
+      </w:r>
+      <w:r>
+        <w:rPr>
+          <w:rFonts w:ascii="Times" w:hAnsi="Times" w:cs="Times"/>
+          <w:sz w:val="24"/>
+          <w:sz-cs w:val="24"/>
+          <w:spacing w:val="0"/>
+        </w:rPr>
+        <w:t xml:space="preserve">units: SI (m, m/s, rad, rad/s); raw frames also supplied in hex</w:t>
+      </w:r>
+    </w:p>
+    <w:p>
+      <w:pPr>
+        <w:ind w:left="720" w:first-line="-720"/>
+      </w:pPr>
+      <w:r>
+        <w:rPr>
+          <w:rFonts w:ascii="Times" w:hAnsi="Times" w:cs="Times"/>
+          <w:sz w:val="24"/>
+          <w:sz-cs w:val="24"/>
+        </w:rPr>
+        <w:t xml:space="preserve"/>
+        <w:tab/>
+        <w:t xml:space="preserve">•</w:t>
+        <w:tab/>
+        <w:t xml:space="preserve"/>
+      </w:r>
+      <w:r>
+        <w:rPr>
+          <w:rFonts w:ascii="Times" w:hAnsi="Times" w:cs="Times"/>
+          <w:sz w:val="24"/>
+          <w:sz-cs w:val="24"/>
+          <w:spacing w:val="0"/>
+        </w:rPr>
+        <w:t xml:space="preserve">limits applied: vx ≤ 0.5 m/s, vy ≤ 0.4 m/s, wz ≤ 0.8 rad/s (test performed at 0.10 m/s)</w:t>
       </w:r>
     </w:p>
     <w:p>
@@ -1021,7 +1007,74 @@
           <w:b/>
           <w:spacing w:val="0"/>
         </w:rPr>
-        <w:t xml:space="preserve">Still to be supplied by the robot integrator (not available on the high-level interface)</w:t>
+        <w:t xml:space="preserve">Notes</w:t>
+      </w:r>
+    </w:p>
+    <w:p>
+      <w:pPr>
+        <w:ind w:left="720" w:first-line="-720"/>
+      </w:pPr>
+      <w:r>
+        <w:rPr>
+          <w:rFonts w:ascii="Times" w:hAnsi="Times" w:cs="Times"/>
+          <w:sz w:val="24"/>
+          <w:sz-cs w:val="24"/>
+        </w:rPr>
+        <w:t xml:space="preserve"/>
+        <w:tab/>
+        <w:t xml:space="preserve">•</w:t>
+        <w:tab/>
+        <w:t xml:space="preserve"/>
+      </w:r>
+      <w:r>
+        <w:rPr>
+          <w:rFonts w:ascii="Times" w:hAnsi="Times" w:cs="Times"/>
+          <w:sz w:val="24"/>
+          <w:sz-cs w:val="24"/>
+          <w:spacing w:val="0"/>
+        </w:rPr>
+        <w:t xml:space="preserve">An earlier attempt with identical commands produced no motion because the robot was sitting/lying — velocity frames are only honoured while the robot is standing. Cause identified, and the successful run below includes the stand step.</w:t>
+      </w:r>
+    </w:p>
+    <w:p>
+      <w:pPr>
+        <w:ind w:left="720" w:first-line="-720"/>
+      </w:pPr>
+      <w:r>
+        <w:rPr>
+          <w:rFonts w:ascii="Times" w:hAnsi="Times" w:cs="Times"/>
+          <w:sz w:val="24"/>
+          <w:sz-cs w:val="24"/>
+        </w:rPr>
+        <w:t xml:space="preserve"/>
+        <w:tab/>
+        <w:t xml:space="preserve">•</w:t>
+        <w:tab/>
+        <w:t xml:space="preserve"/>
+      </w:r>
+      <w:r>
+        <w:rPr>
+          <w:rFonts w:ascii="Times" w:hAnsi="Times" w:cs="Times"/>
+          <w:sz w:val="24"/>
+          <w:sz-cs w:val="24"/>
+          <w:spacing w:val="0"/>
+        </w:rPr>
+        <w:t xml:space="preserve">UDP provides no acknowledgement; motion was confirmed by direct observation during the run.</w:t>
+      </w:r>
+    </w:p>
+    <w:p>
+      <w:pPr>
+        <w:spacing w:after="298"/>
+      </w:pPr>
+      <w:r>
+        <w:rPr>
+          <w:rFonts w:ascii="Times" w:hAnsi="Times" w:cs="Times"/>
+          <w:sz w:val="36"/>
+          <w:sz-cs w:val="36"/>
+          <w:b/>
+          <w:spacing w:val="0"/>
+        </w:rPr>
+        <w:t xml:space="preserve">Still to be supplied (not available on the high-level interface)</w:t>
       </w:r>
     </w:p>
     <w:p>
@@ -1151,7 +1204,7 @@
           <w:sz-cs w:val="24"/>
           <w:spacing w:val="0"/>
         </w:rPr>
-        <w:t xml:space="preserve"> bridge (rosbag record /joint_states /leg_odom2 /imu/data), run with the robot’s ~/jy_exe/conf/network.toml pointing at the logging host. Once that access is available, the same maneuver will be re-run and the joint-level CSV/JSON added to this document.</w:t>
+        <w:t xml:space="preserve"> bridge (rosbag of /joint_states, /leg_odom2, /imu/data), run with the robot’s ~/jy_exe/conf/network.toml pointing at the logging host. Once that access is available the same manoeuvre will be re-run and the joint-level CSV/JSON added here.</w:t>
       </w:r>
     </w:p>
     <w:sectPr/>

</xml_diff>